<commit_message>
Recommend explicit, result-linked claims in the conclusions
Grounded in the documentation finding (2.7% of medical and 6.1% of other papers tie each main claim to a
specific result) and reported with the Note 9-9 PH9-b result that claim linkage did not account for the decided
gap, so it is framed as a recommendation, not an estimated effect. New numbers are checked by build_assets.py.

Co-Authored-By: Claude Opus 5.5 <noreply@anthropic.com>
</commit_message>
<xml_diff>
--- a/manuscript/out/manuscript.docx
+++ b/manuscript/out/manuscript.docx
@@ -154,7 +154,7 @@
         <w:t>Results.</w:t>
       </w:r>
       <w:r>
-        <w:t xml:space="preserve"> Among papers that stated each practice, medical papers released code in 59% versus 46% (pooled difference +13 points, 95% CI +10 to +17), reported variance in 66% versus 42% (+24, +21 to +28) and reported openly available main data more often (+15, +11 to +19). Restricted to empirical papers the differences were smaller but held (code +11, +6 to +15; open data +7, +2 to +12). Releases of weights, outputs and sample data were rarely stated by either group. In the challenge, attempted medical papers received a verified or falsified verdict 19 points less often than 1,821 other attempted papers (CI −28 to −10; permutation p &lt; 0.001), mainly clinical papers, and their undecided claims were mostly rated inconclusive (49% versus 25% of claims). Within the same team, claims were decided about equally often (−3.6, −7.8 to +0.8). Medical papers were first taken up by teams that settled fewer of their other papers (40% versus 60%). Adjusting for this first-team strength removed the gap in being decided (−3.6, −12 to +5) but not in full verification (−12, −15 to −8). In a subsample of 220 papers whose claims were coded, medical claims more often needed retraining or large-scale runs (57% versus 39%), and adjusting for both factors reduced the full-verification gap to −6 (−12 to +1). Stated practices predicted poorly what reproducers obtained (code: kappa 0.22).</w:t>
+        <w:t xml:space="preserve"> Among papers that stated each practice, medical papers released code in 59% versus 46% (pooled difference +13 points, 95% CI +10 to +17), reported variance in 66% versus 42% (+24, +21 to +28) and reported openly available main data more often (+15, +11 to +19). Restricted to empirical papers the differences were smaller but held (code +11, +6 to +15; open data +7, +2 to +12). Releases of weights, outputs and sample data were rarely stated by either group, and few papers listed their main claims with each tied to a specific table, figure or theorem (2.7% of medical versus 6.1% of other papers). In the challenge, attempted medical papers received a verified or falsified verdict 19 points less often than 1,821 other attempted papers (CI −28 to −10; permutation p &lt; 0.001), mainly clinical papers, and their undecided claims were mostly rated inconclusive (49% versus 25% of claims). Within the same team, claims were decided about equally often (−3.6, −7.8 to +0.8). Medical papers were first taken up by teams that settled fewer of their other papers (40% versus 60%). Adjusting for this first-team strength removed the gap in being decided (−3.6, −12 to +5) but not in full verification (−12, −15 to −8). In a subsample of 220 papers whose claims were coded, medical claims more often needed retraining or large-scale runs (57% versus 39%), and adjusting for both factors reduced the full-verification gap to −6 (−12 to +1). Stated practices predicted poorly what reproducers obtained (code: kappa 0.22).</w:t>
       </w:r>
     </w:p>
     <w:p>
@@ -165,7 +165,7 @@
         <w:t>Conclusions.</w:t>
       </w:r>
       <w:r>
-        <w:t xml:space="preserve"> Medical papers at top ML venues are not less documented than other papers. In crowd reproduction they are settled less often, and the gap follows the teams that take them up and, in part, the cost of checking their claims. Reproduction efforts should report who attempted each paper and what its claims cost to check.</w:t>
+        <w:t xml:space="preserve"> Medical papers at top ML venues are not less documented than other papers. In crowd reproduction they are settled less often, and the gap follows the teams that take them up and, in part, the cost of checking their claims. Authors should state their main claims explicitly and tie each one to the specific result that supports it, and reproduction efforts should report who attempted each paper and what its claims cost to check.</w:t>
       </w:r>
     </w:p>
     <w:p>
@@ -488,7 +488,7 @@
     </w:p>
     <w:p>
       <w:r>
-        <w:t>Table 2 and Figure 3 show the post hoc decomposition. The judge did not treat medical claims differently: within the same team, claims of medical papers were decided 3.6 points less often than claims of other papers (−7.8 to +0.8), against 29.1 points less often without this adjustment. The first team to take up a medical paper had settled 40.0% of its other attempted papers, against 60.3% for teams first on other papers (−20.3, −26.0 to −14.3). Team strength behaved as a property of the team: on 903 papers attempted by at least two teams, the stronger team decided the same paper 32.3 points more often than the weaker one (+29.9 to +34.7). Adjusting for first-team strength reduced the decided gap from −19.1 to −3.6 points (−11.9 to +5.1), which meets the reading rule. It did not account for full verification: on all attempted papers that gap was −11.7 points (−14.7 to −8.0) after the adjustment.</w:t>
+        <w:t>Table 2 and Figure 3 show the post hoc decomposition. The judge did not treat medical claims differently: within the same team, claims of medical papers were decided 3.6 points less often than claims of other papers (−7.8 to +0.8), against 29.1 points less often without this adjustment. The first team to take up a medical paper had settled 40.0% of its other attempted papers, against 60.3% for teams first on other papers (−20.3, −26.0 to −14.3). Team strength behaved as a property of the team: on 903 papers attempted by at least two teams, the stronger team decided the same paper 32.3 points more often than the weaker one (+29.9 to +34.7). Adjusting for first-team strength reduced the decided gap from −19.1 to −3.6 points (−11.9 to +5.1), which meets the reading rule. It did not account for full verification: on all attempted papers that gap was −11.7 points (−14.7 to −8.0) after the adjustment. Whether a paper listed and linked its claims did not account for the decided gap either (adjusted −15.3 points, −28.5 to −2.2; 216 frame papers); few attempted papers in either group linked each claim to a result (3 medical and 9 other papers).</w:t>
       </w:r>
     </w:p>
     <w:p>
@@ -568,7 +568,7 @@
     </w:p>
     <w:p>
       <w:r>
-        <w:t>For venues and challenge organisers, the main implication is that the share of papers verified depends on who attempts them and on what their claims cost to check, not only on what authors provide. A verified rate reported without these two factors would mislead readers about medical papers. We suggest that crowd reproduction efforts report, per paper, the number and track record of the teams that attempted it and the share of its claims that need retraining or large-scale runs. Reporting guidelines for ML-based science [12] and for clinical prediction models that use ML [13] concern what authors state. Our results suggest that, at these venues, medical papers already state more than others, and that whether a crowd settles them depends on more than what is stated.</w:t>
+        <w:t>For venues and challenge organisers, the main implication is that the share of papers verified depends on who attempts them and on what their claims cost to check, not only on what authors provide. A verified rate reported without these two factors would mislead readers about medical papers. We suggest that crowd reproduction efforts report, per paper, the number and track record of the teams that attempted it and the share of its claims that need retraining or large-scale runs. For authors, one gap is common to both groups and wider in medical papers: most papers list their contributions, but only 2.7% of medical and 6.1% of other papers tie each main claim to the table, figure or theorem that supports it. A reproducer, human or agent, has to reconstruct this mapping before checking anything. Stating each claim explicitly and linking it to a specific result is cheap, and it fixes what a reproduction is asked to settle. In our data claim linkage was too rare to show whether it changes outcomes, so this is a recommendation from the documentation finding, not an estimated effect. Reporting guidelines for ML-based science [12] and for clinical prediction models that use ML [13] concern what authors state. Our results suggest that, at these venues, medical papers already state more than others, and that whether a crowd settles them depends on more than what is stated.</w:t>
       </w:r>
     </w:p>
     <w:p>
@@ -620,7 +620,7 @@
     </w:p>
     <w:p>
       <w:r>
-        <w:t>Medical papers at top ML venues are not less documented than other papers at the same venues, yet in agentic crowd reproduction they are settled less often. The gap follows the teams that take them up and, in part, the cost of their claims, not a lack of stated materials. Reports of crowd reproduction should state who attempted each paper and what its claims cost to check.</w:t>
+        <w:t>Medical papers at top ML venues are not less documented than other papers at the same venues, yet in agentic crowd reproduction they are settled less often. The gap follows the teams that take them up and, in part, the cost of their claims, not a lack of stated materials. Authors should state their main claims explicitly and tie each one to the specific result that supports it, and reports of crowd reproduction should state who attempted each paper and what its claims cost to check.</w:t>
       </w:r>
     </w:p>
     <w:p>

</xml_diff>

<commit_message>
Fix the LaTeX layout: readable tables, redrawn flow diagram, inline vector figures
Tables get fixed column widths so the first column no longer collapses and nothing runs past the margin; table
and figure numbers are pinned to the text. Figure 1 is redrawn with aligned boxes and arrows that end on box edges;
all figures are also written as vector PDF and placed after the paragraph that first cites them. The text now cites
Figure 2, which it never did. Compiles to 13 pages without errors.

Co-Authored-By: Claude Opus 5.5 <noreply@anthropic.com>
</commit_message>
<xml_diff>
--- a/manuscript/out/manuscript.docx
+++ b/manuscript/out/manuscript.docx
@@ -457,7 +457,7 @@
     </w:p>
     <w:p>
       <w:r>
-        <w:t>Table 1 gives every indicator. Among papers with a known value, medical papers stated nine of the ten practices more often than other papers. They released code in 59.4% of papers with a known value against 46.2% (pooled difference +13.1 points, 95% CI +9.6 to +16.6), reported open main data in 83.7% against 67.3% (+15.0, +10.7 to +19.3), released weights in 48.6% against 19.4% (+28.6, +21.6 to +35.0) and reported variance in 66.4% against 42.1% (+24.4, +20.7 to +27.9). None of the three prespecified hypotheses was accepted: all three differences ran in the opposite direction. The exception was claims listed and each tied to a table, figure or theorem, which was rare in both groups (2.7% against 6.1%, −3.3 points, −4.7 to −1.9). Compute was rarely stated by either group (21.7% and 17.1% gave an amount), and most papers did not state their compute tier (1,349 of 1,568 medical papers).</w:t>
+        <w:t>Table 1 and Figure 2 give every indicator. Among papers with a known value, medical papers stated nine of the ten practices more often than other papers. They released code in 59.4% of papers with a known value against 46.2% (pooled difference +13.1 points, 95% CI +9.6 to +16.6), reported open main data in 83.7% against 67.3% (+15.0, +10.7 to +19.3), released weights in 48.6% against 19.4% (+28.6, +21.6 to +35.0) and reported variance in 66.4% against 42.1% (+24.4, +20.7 to +27.9). None of the three prespecified hypotheses was accepted: all three differences ran in the opposite direction. The exception was claims listed and each tied to a table, figure or theorem, which was rare in both groups (2.7% against 6.1%, −3.3 points, −4.7 to −1.9). Compute was rarely stated by either group (21.7% and 17.1% gave an amount), and most papers did not state their compute tier (1,349 of 1,568 medical papers).</w:t>
       </w:r>
     </w:p>
     <w:p>
@@ -3484,7 +3484,7 @@
       <w:r>
         <w:drawing>
           <wp:inline xmlns:a="http://schemas.openxmlformats.org/drawingml/2006/main" xmlns:pic="http://schemas.openxmlformats.org/drawingml/2006/picture">
-            <wp:extent cx="5760000" cy="5724859"/>
+            <wp:extent cx="5760000" cy="5465197"/>
             <wp:docPr id="1" name="Picture 1"/>
             <wp:cNvGraphicFramePr>
               <a:graphicFrameLocks noChangeAspect="1"/>
@@ -3505,7 +3505,7 @@
                   <pic:spPr>
                     <a:xfrm>
                       <a:off x="0" y="0"/>
-                      <a:ext cx="5760000" cy="5724859"/>
+                      <a:ext cx="5760000" cy="5465197"/>
                     </a:xfrm>
                     <a:prstGeom prst="rect"/>
                   </pic:spPr>
@@ -3531,7 +3531,7 @@
       <w:r>
         <w:drawing>
           <wp:inline xmlns:a="http://schemas.openxmlformats.org/drawingml/2006/main" xmlns:pic="http://schemas.openxmlformats.org/drawingml/2006/picture">
-            <wp:extent cx="5760000" cy="3049152"/>
+            <wp:extent cx="5760000" cy="3057715"/>
             <wp:docPr id="2" name="Picture 2"/>
             <wp:cNvGraphicFramePr>
               <a:graphicFrameLocks noChangeAspect="1"/>
@@ -3552,7 +3552,7 @@
                   <pic:spPr>
                     <a:xfrm>
                       <a:off x="0" y="0"/>
-                      <a:ext cx="5760000" cy="3049152"/>
+                      <a:ext cx="5760000" cy="3057715"/>
                     </a:xfrm>
                     <a:prstGeom prst="rect"/>
                   </pic:spPr>
@@ -3578,7 +3578,7 @@
       <w:r>
         <w:drawing>
           <wp:inline xmlns:a="http://schemas.openxmlformats.org/drawingml/2006/main" xmlns:pic="http://schemas.openxmlformats.org/drawingml/2006/picture">
-            <wp:extent cx="5760000" cy="4741083"/>
+            <wp:extent cx="5760000" cy="4772313"/>
             <wp:docPr id="3" name="Picture 3"/>
             <wp:cNvGraphicFramePr>
               <a:graphicFrameLocks noChangeAspect="1"/>
@@ -3599,7 +3599,7 @@
                   <pic:spPr>
                     <a:xfrm>
                       <a:off x="0" y="0"/>
-                      <a:ext cx="5760000" cy="4741083"/>
+                      <a:ext cx="5760000" cy="4772313"/>
                     </a:xfrm>
                     <a:prstGeom prst="rect"/>
                   </pic:spPr>

</xml_diff>

<commit_message>
Remove two copied files that list participants' account names; tighten the abstract
audit/public_repro_audit.csv and verdict_audit/e1_adjusted/keys/e1_evidence_key.csv come from earlier protocols and
list challenge participants' public account names; no Protocol 9 analysis reads them (all Protocol 9 results rerun
byte-identical without them). README and PROVENANCE say where they remain. README also records that
posthoc_p9_uptake.py needs the 2026-07-18 claims_anchored.json, which is not in the data registry.
The abstract drops the chain of secondary analyses, the conclusions no longer repeat the team-and-cost formula, and
the within-team comparison is no longer read as proof that the judge treated medical claims the same.

Co-Authored-By: Claude Opus 5.5 <noreply@anthropic.com>
</commit_message>
<xml_diff>
--- a/manuscript/out/manuscript.docx
+++ b/manuscript/out/manuscript.docx
@@ -154,7 +154,7 @@
         <w:t>Results.</w:t>
       </w:r>
       <w:r>
-        <w:t xml:space="preserve"> Among papers that stated each practice, medical papers released code in 59% versus 46% (pooled difference +13 points, 95% CI +10 to +17), reported variance in 66% versus 42% (+24, +21 to +28) and reported openly available main data more often (+15, +11 to +19). Restricted to empirical papers the differences were smaller but held (code +11, +6 to +15; open data +7, +2 to +12). Releases of weights, outputs and sample data were rarely stated by either group, and few papers listed their main claims with each tied to a specific table, figure or theorem (2.7% of medical versus 6.1% of other papers). In the challenge, attempted medical papers received a verified or falsified verdict 19 points less often than 1,821 other attempted papers (CI −28 to −10; permutation p &lt; 0.001), mainly clinical papers, and their undecided claims were mostly rated inconclusive (49% versus 25% of claims). Within the same team, claims were decided about equally often (−3.6, −7.8 to +0.8). Medical papers were first taken up by teams that settled fewer of their other papers (40% versus 60%). Adjusting for this first-team strength removed the gap in being decided (−3.6, −12 to +5) but not in full verification (−12, −15 to −8). In a subsample of 220 papers whose claims were coded, medical claims more often needed retraining or large-scale runs (57% versus 39%), and adjusting for both factors reduced the full-verification gap to −6 (−12 to +1). Stated practices predicted poorly what reproducers obtained (code: kappa 0.22).</w:t>
+        <w:t xml:space="preserve"> Among papers that stated each practice, medical papers released code (59% versus 46%; pooled difference +13 points, 95% CI +10 to +17), reported variance (66% versus 42%; +24, +21 to +28) and reported openly available main data (+15, +11 to +19) more often, also among empirical papers only. Few papers in either group tied their main claims to a specific table, figure or theorem (2.7% versus 6.1%). In the challenge, attempted medical papers received a verified or falsified verdict 19 points less often than 1,821 other attempted papers (CI −28 to −10), and more of their claims were rated inconclusive (49% versus 25%). Within the same team, claims of medical and other papers were decided about equally often (−3.6, −7.8 to +0.8). In exploratory analyses, the gap was largely accounted for by which teams took medical papers up and, for full verification, also by the cost of checking their claims. What papers stated agreed poorly with what reproducers obtained (code: kappa 0.22).</w:t>
       </w:r>
     </w:p>
     <w:p>
@@ -165,7 +165,7 @@
         <w:t>Conclusions.</w:t>
       </w:r>
       <w:r>
-        <w:t xml:space="preserve"> Medical papers at top ML venues are not less documented than other papers. In crowd reproduction they are settled less often, and the gap follows the teams that take them up and, in part, the cost of checking their claims. Authors should state their main claims explicitly and tie each one to the specific result that supports it, and reproduction efforts should report who attempted each paper and what its claims cost to check.</w:t>
+        <w:t xml:space="preserve"> Medical papers at top ML venues are not less documented than other papers, yet crowd reproduction settles them less often. Authors should tie each main claim to the result that supports it, and reproduction efforts should report who attempted each paper and what its claims cost to check.</w:t>
       </w:r>
     </w:p>
     <w:p>
@@ -487,7 +487,7 @@
     </w:p>
     <w:p>
       <w:r>
-        <w:t>Table 2 and Figure 4 show the post hoc decomposition. The judge did not treat medical claims differently: within the same team, claims of medical papers were decided 3.6 points less often than claims of other papers (−7.8 to +0.8), against 29.1 points less often without this adjustment. The first team to take up a medical paper had settled 40.0% of its other attempted papers, against 60.3% for teams first on other papers (−20.3, −26.0 to −14.3). Team strength behaved as a property of the team: on 903 papers attempted by at least two teams, the stronger team decided the same paper 32.3 points more often than the weaker one (+29.9 to +34.7). Adjusting for first-team strength reduced the decided gap from −19.1 to −3.6 points (−11.9 to +5.1), which meets the reading rule. It did not account for full verification: on all attempted papers that gap was −11.7 points (−14.7 to −8.0) after the adjustment. Whether a paper listed and linked its claims did not account for the decided gap either (adjusted −15.3 points, −28.5 to −2.2; 216 frame papers); few attempted papers in either group linked each claim to a result (3 medical and 9 other papers).</w:t>
+        <w:t>Table 2 and Figure 4 show the post hoc decomposition. Within the same team, claims of medical papers were decided 3.6 points less often than claims of other papers (−7.8 to +0.8), against 29.1 points less often without this adjustment, so most of the claim-level gap lies between teams rather than within them. This comparison holds the team fixed but not the claims, and its interval does not rule out a smaller difference in how the judge rated medical claims. The first team to take up a medical paper had settled 40.0% of its other attempted papers, against 60.3% for teams first on other papers (−20.3, −26.0 to −14.3). Team strength behaved as a property of the team: on 903 papers attempted by at least two teams, the stronger team decided the same paper 32.3 points more often than the weaker one (+29.9 to +34.7). Adjusting for first-team strength reduced the decided gap from −19.1 to −3.6 points (−11.9 to +5.1), which meets the reading rule. It did not account for full verification: on all attempted papers that gap was −11.7 points (−14.7 to −8.0) after the adjustment. Whether a paper listed and linked its claims did not account for the decided gap either (adjusted −15.3 points, −28.5 to −2.2; 216 frame papers); few attempted papers in either group linked each claim to a result (3 medical and 9 other papers).</w:t>
       </w:r>
     </w:p>
     <w:p>
@@ -535,7 +535,7 @@
     </w:p>
     <w:p>
       <w:r>
-        <w:t>Across nine venue-years of six top ML venues, medical papers stated code, open data and variance more often than other papers did, also among empirical papers only. This contradicts the assumption we set out to test. Weights and other releases were stated too rarely to compare. Yet in the one venue where outcomes could be observed, medical papers were settled less often by agentic reproducers, and their undecided claims were mostly inconclusive rather than checked at reduced scale. The gap was not in how the judge treated their claims. It went with which teams took the papers up: medical papers were taken up by fewer teams, first by teams that settled fewer papers of any kind, and this accounted for the gap in being decided at all. Team strength alone did not account for the gap in full verification. In a subsample of 220 papers, medical claims more often required retraining or large runs, and with both factors taken into account that gap fell from −19 to −6 points with an interval that included zero.</w:t>
+        <w:t>Across nine venue-years of six top ML venues, medical papers stated code, open data and variance more often than other papers did, also among empirical papers only. This contradicts the assumption we set out to test. Weights and other releases were stated too rarely to compare. Yet in the one venue where outcomes could be observed, medical papers were settled less often by agentic reproducers, and their undecided claims were mostly inconclusive rather than checked at reduced scale. Within teams, medical and other claims were decided about equally often, which places most of the gap between teams rather than in the judge's ratings, although a small judge effect cannot be excluded. Medical papers were taken up by fewer teams, and first by teams that settled fewer papers of any kind; this accounted for the gap in being decided at all. The gap in full verification also needed the higher cost of checking medical claims to be accounted for, in a subsample of 220 papers.</w:t>
       </w:r>
     </w:p>
     <w:p>
@@ -567,7 +567,7 @@
     </w:p>
     <w:p>
       <w:r>
-        <w:t>The share of papers verified in a crowd reproduction depends on who attempts them and on what their claims cost to check, not only on what authors provide. A verified rate reported without these two factors would mislead readers about medical papers. Reporting guidelines for ML-based science [15], for clinical prediction models that use ML [16] and for deep learning in medical imaging [17] concern what authors state; at these venues medical papers already state more than others, and whether a crowd settles them depends on more than what is stated. The recommendations below follow from the measurements in this study; none of them was tested as an intervention.</w:t>
+        <w:t>A verified rate reported without the teams behind it would mislead readers about medical papers, whose documentation is not the weak point. Reporting guidelines for ML-based science [15], for clinical prediction models that use ML [16] and for deep learning in medical imaging [17] concern what authors state; at these venues medical papers already state more than others, and whether a crowd settles them depends on more than what is stated. The recommendations below follow from the measurements in this study; none of them was tested as an intervention.</w:t>
       </w:r>
     </w:p>
     <w:p>
@@ -717,7 +717,7 @@
     </w:p>
     <w:p>
       <w:r>
-        <w:t>Medical papers at top ML venues are not less documented than other papers at the same venues, yet in agentic crowd reproduction they are settled less often. The gap follows the teams that take them up and, in part, the cost of their claims, not a lack of stated materials. Authors should state their main claims explicitly and tie each one to the specific result that supports it, and reports of crowd reproduction should state who attempted each paper and what its claims cost to check.</w:t>
+        <w:t>Medical papers at top ML venues are not less documented than other papers, yet agentic crowd reproduction settles them less often. More documentation alone is unlikely to close that gap. Explicit claims tied to specific results would make medical papers easier to check, and reports of crowd reproduction need to show who attempted each paper before its verdict can be compared across fields.</w:t>
       </w:r>
     </w:p>
     <w:p>

</xml_diff>

<commit_message>
Editorial pass: reported practices, precise outcome language, neutral captions
New title. Reported rather than stated or released throughout; decided instead of settled; first-team performance on
other papers instead of team strength; coded claim requirements instead of claim cost; changes in estimates with
intervals instead of gaps that disappear or are explained. Methods say that excerpts were coded, define fully
verified per logbook and first-team performance, and state the interpretation criterion as descriptive, not causal.
Results report subgroup and toy-verdict estimates without equivalence claims. Discussion, recommendations,
limitations, conclusions, declarations, appendix and captions follow the same rules; figure and table labels too.
All quoted numbers are re-checked against the result files.

Co-Authored-By: Claude Opus 5.5 <noreply@anthropic.com>
</commit_message>
<xml_diff>
--- a/manuscript/out/manuscript.docx
+++ b/manuscript/out/manuscript.docx
@@ -10,7 +10,7 @@
         <w:rPr>
           <w:rFonts w:ascii="Times New Roman" w:hAnsi="Times New Roman"/>
         </w:rPr>
-        <w:t>Reproducibility practice in medical and life-science papers at top machine-learning venues and their agentic reproduction: a systematic meta-research study</w:t>
+        <w:t>Reported reproducibility practices and agentic reproduction outcomes in medical and life-science papers at major ML conferences: a systematic meta-research study</w:t>
       </w:r>
     </w:p>
     <w:p>
@@ -132,7 +132,7 @@
         <w:t>Background.</w:t>
       </w:r>
       <w:r>
-        <w:t xml:space="preserve"> Medical machine-learning (ML) papers are often assumed to be hard to reproduce because their data are restricted and their code is not shared. Agentic reproduction, in which AI agents attempt to rerun published work, now makes it possible to test this at conference scale.</w:t>
+        <w:t xml:space="preserve"> Restricted data and unavailable code are common concerns in medical machine learning (ML). We examined how medical papers report reproducibility practices and what happens when independent teams attempt to reproduce them using AI agents.</w:t>
       </w:r>
     </w:p>
     <w:p>
@@ -143,7 +143,7 @@
         <w:t>Methods.</w:t>
       </w:r>
       <w:r>
-        <w:t xml:space="preserve"> We drew all 2,170 papers labelled clinical or life science (together, medical papers) by blind language-model coders (Cohen's kappa 0.96) from nine venue-years of CVPR, ICCV, ECCV, ICLR, ICML and NeurIPS (2025 to 2026), and an equal random sample of other papers. One language-model coder read all 3,278 full texts we could retrieve and a second, blind coder a random 25%, under a protocol frozen before data collection; twelve reproducibility practices were coded. Differences were pooled across venue-years with Mantel-Haenszel risk differences and paper bootstrap intervals. Reproduction outcomes came from the public verdicts of the ICML 2026 agent reproduction challenge.</w:t>
+        <w:t xml:space="preserve"> We identified 2,170 clinical or life-science papers across nine venue-years at CVPR, ICCV, ECCV, ICLR, ICML and NeurIPS in 2025 and 2026, and randomly sampled 2,170 other papers. We refer to the clinical and life-science groups together as medical papers. Agreement between the domain coders was high (Cohen's kappa 0.96). One language-model coder assessed excerpts from all 3,278 retrieved full texts. A second coder independently assessed a random 25%; fields below the agreement threshold underwent duplicate coding across the full sample. Differences were pooled across venue-years with Mantel-Haenszel risk differences and paper bootstrap intervals, under a protocol frozen before sample selection. Reproduction outcomes came from the public verdicts of the ICML 2026 agent reproduction challenge.</w:t>
       </w:r>
     </w:p>
     <w:p>
@@ -154,7 +154,7 @@
         <w:t>Results.</w:t>
       </w:r>
       <w:r>
-        <w:t xml:space="preserve"> Among papers that stated each practice, medical papers released code (59% versus 46%; pooled difference +13 points, 95% CI +10 to +17), reported variance (66% versus 42%; +24, +21 to +28) and reported openly available main data (+15, +11 to +19) more often, also among empirical papers only. Few papers in either group tied their main claims to a specific table, figure or theorem (2.7% versus 6.1%). In the challenge, attempted medical papers received a verified or falsified verdict 19 points less often than 1,821 other attempted papers (CI −28 to −10), and more of their claims were rated inconclusive (49% versus 25%). Within the same team, claims of medical and other papers were decided about equally often (−3.6, −7.8 to +0.8). In exploratory analyses, the gap was largely accounted for by which teams took medical papers up and, for full verification, also by the cost of checking their claims. What papers stated agreed poorly with what reproducers obtained (code: kappa 0.22).</w:t>
+        <w:t xml:space="preserve"> Among papers with a known code-release status, 59% of medical papers reported releasing code, compared with 46% of other papers (pooled difference +13 percentage points, 95% CI +10 to +17). Medical papers also more often reported variance (66% versus 42%; +24, +21 to +28) and open main data (+15, +11 to +19). Few papers in either group linked their main claims to a specific table, figure or theorem (2.7% versus 6.1%). In the challenge, attempted medical papers less often received a verified or falsified verdict on at least one claim than 1,821 other attempted papers (−19 percentage points, 95% CI −28 to −10), and more of their claims were rated inconclusive (49% versus 25%). In comparisons within the same team, the estimated difference in the proportion of claims decided was −3.6 percentage points (95% CI −7.8 to +0.8). After adjustment for the first team's performance on other papers, the difference in papers with a decided claim decreased from −19.1 to −3.6 percentage points (95% CI −11.9 to +5.1). A difference in full verification remained (−11.7, −14.7 to −8.0). In the 220-paper subsample, coders classified medical claims as requiring retraining or large-scale runs more often than other claims (57% versus 39%); adjustment for both first-team performance and claim requirements reduced the full-verification difference to −6 percentage points (95% CI −12 to +1). Reported practices showed limited agreement with logbook evidence of material use (code: kappa 0.22).</w:t>
       </w:r>
     </w:p>
     <w:p>
@@ -165,7 +165,7 @@
         <w:t>Conclusions.</w:t>
       </w:r>
       <w:r>
-        <w:t xml:space="preserve"> Medical papers at top ML venues are not less documented than other papers, yet crowd reproduction settles them less often. Authors should tie each main claim to the result that supports it, and reproduction efforts should report who attempted each paper and what its claims cost to check.</w:t>
+        <w:t xml:space="preserve"> Medical papers reported several reproducibility practices more often than other papers at the same venues. In the ICML 2026 challenge, they less often received a verified or falsified verdict on at least one claim. Exploratory adjustments reduced this difference after accounting for first-team performance; the remaining difference in full verification was further reduced after accounting for claim requirements in a subsample. Authors should link their main claims to the results that support them.</w:t>
       </w:r>
     </w:p>
     <w:p>
@@ -181,17 +181,17 @@
     </w:p>
     <w:p>
       <w:r>
-        <w:t>Concerns about the reproducibility of medical artificial intelligence are long-standing. When a high-profile study of AI for breast cancer screening was published without its code and with few methodological details, critics argued that this undermined its scientific value [1]. A survey of 511 papers found that ML for health compared poorly with other areas of ML on dataset and code accessibility [2]. In the radiology journals of the RSNA, 34% of 218 AI articles shared code and 11% shared code that reproduced [3], and at the Medical Imaging with Deep Learning conference only 22% of accepted full papers from 2018 to 2022 had a repository judged repeatable [4]. An audit of 400 AI conference papers found that none documented all the variables a reproduction needs [5]. NeurIPS responded with a code submission policy, a reproducibility checklist and a community-wide reproducibility challenge [6], and failures such as data leakage have been traced across 17 fields that apply ML [7].</w:t>
+        <w:t>Previous studies have documented limited access to code and data in medical AI research. When a high-profile study of AI for breast cancer screening was published without its code and with few methodological details, critics argued that this undermined its scientific value [1]. A survey of 511 papers found that ML for health compared poorly with other areas of ML on dataset and code accessibility [2]. In the radiology journals of the RSNA, 34% of 218 AI articles shared code and 11% shared code that reproduced [3], and at the Medical Imaging with Deep Learning conference only 22% of accepted full papers from 2018 to 2022 had a repository judged repeatable [4]. An audit of 400 AI conference papers found that none documented all the variables a reproduction needs [5]. NeurIPS responded with a code submission policy, a reproducibility checklist and a community-wide reproducibility challenge [6], and failures such as data leakage have been traced across 17 fields that apply ML [7].</w:t>
       </w:r>
     </w:p>
     <w:p>
       <w:r>
-        <w:t>These studies measure what authors state. Whether stated materials let a third party settle a paper's claims is a different question, and until recently it could not be asked at scale, because each reproduction took weeks of expert work. AI agents now attempt reproductions of whole papers [8]. In 2026 the International Conference on Machine Learning (ICML) ran an open agent reproduction challenge in which more than 1,200 participants published 6,816 reproduction logbooks on 2,226 conference papers, and an automated judge rated 35,908 claims as verified, falsified, toy (evidence at reduced scale) or inconclusive [9]. This gives, for one venue, an outcome for reproduction that does not depend on what authors say about their own work.</w:t>
+        <w:t>Previous studies assessed reporting, access to research materials and, in some cases, whether shared code could be run [3, 4]. Whether independent attempts can verify or falsify a paper's claims requires evidence from reproduction attempts. AI agents now attempt reproductions of whole papers [8], and agentic reproduction challenges now provide these records for large numbers of papers. In 2026 the International Conference on Machine Learning (ICML) ran an open agent reproduction challenge in which more than 1,200 participants published 6,816 reproduction logbooks on 2,226 conference papers, and an automated judge rated 35,908 claims as verified, falsified, toy (evidence at reduced scale) or inconclusive [9]. These records provide reproduction outcomes for one venue, based on evidence submitted in logbooks and assessed by an automated judge.</w:t>
       </w:r>
     </w:p>
     <w:p>
       <w:r>
-        <w:t>We asked two questions. First, do medical papers at top ML venues state reproducibility practices less often than other papers, as is commonly assumed? Second, in the ICML 2026 challenge, are medical papers settled (verified or falsified) as often as other papers, and if not, why? An earlier protocol of ours on the venue listings (Protocol 7, Supplementary File S1) had already found that medical papers declare a code link in the venue metadata more often than other papers (24.5% versus 16.9% across twelve venue-years, +7.4 points, 95% CI +5.8 to +9.0). For the practices that the metadata does not show (open data, weights and variance), we nonetheless prespecified the common assumption, that medical papers report them less often, as directional hypotheses. The full texts showed the opposite, and the outcomes showed a gap in the other direction, which we then examined with post hoc analyses whose reading rules were fixed before computing.</w:t>
+        <w:t>We compared reported reproducibility practices between medical and other papers at the same ML venues. We then compared reproduction outcomes in the ICML 2026 challenge and explored whether differences were associated with the teams attempting the papers and the requirements of their claims. An earlier protocol of ours on the venue listings (Protocol 7, Supplementary File S1) had already found that medical papers declare a code link in the venue metadata more often than other papers (24.5% versus 16.9% across twelve venue-years, +7.4 percentage points, 95% CI +5.8 to +9.0). For the practices that the metadata does not show (open data, weights and variance), we nonetheless prespecified the common assumption, that medical papers report them less often, as directional hypotheses. The full-text analysis did not support these directional hypotheses: medical papers reported the practices more often. Reproduction outcomes were less favourable for medical papers. We examined this difference in post hoc analyses, with interpretation criteria recorded before each analysis was run.</w:t>
       </w:r>
     </w:p>
     <w:p>
@@ -207,7 +207,7 @@
     </w:p>
     <w:p>
       <w:r>
-        <w:t>The study followed a protocol frozen in a public repository before any data were collected, and is reported following the PRISMA 2020 statement [10] where its items apply to a meta-research study of published papers. The protocol, its amendments and the reporting checklist are described in Appendix A.</w:t>
+        <w:t>Protocol 9 was frozen in a public repository before selection of the study sample, full-text retrieval and coding. It was developed after the results of earlier protocols on the same challenge were known. The study is reported following the PRISMA 2020 statement [10] where its items apply to a meta-research study of published papers. The protocol, its amendments and the reporting checklist are described in Appendix A.</w:t>
       </w:r>
     </w:p>
     <w:p>
@@ -258,7 +258,7 @@
         <w:t>no</w:t>
       </w:r>
       <w:r>
-        <w:t xml:space="preserve"> from title and abstract only by a blind language-model coder; a second blind coder labelled a random 25% of candidates (1,633 papers over the whole listing; agreement 97.7%, Cohen's kappa 0.96 [11]; gate 0.80) and disagreements were adjudicated with a written reason. Of the candidates, 1,013 were labelled clinical and 1,157 life science, together the 2,170 medical papers, and 3,360 were excluded. To estimate how many medical papers the prefilter missed, both coders labelled a random 200 non-candidates; none was medical (0 of 200, 95% Wilson interval [12] 0 to 1.9%). The comparison group was a random sample of 2,170 non-candidates, allocated to venue-years in proportion to the medical counts (seed 20261019).</w:t>
+        <w:t xml:space="preserve"> from title and abstract only by a blind language-model coder; a second blind coder labelled a random 25% of candidates (1,633 papers over the whole listing; agreement 97.7%, Cohen's kappa 0.96 [11]; threshold 0.80) and disagreements were adjudicated with a written reason. Of the candidates, 1,013 were labelled clinical and 1,157 life science, together the 2,170 medical papers, and 3,360 were excluded. To estimate how many medical papers the prefilter missed, both coders labelled a random 200 non-candidates; none was medical (0 of 200, 95% Wilson interval [12] 0 to 1.9%). The comparison group was a random sample of 2,170 non-candidates, allocated to venue-years in proportion to the medical counts (seed 20261019).</w:t>
       </w:r>
     </w:p>
     <w:p>
@@ -274,7 +274,7 @@
     </w:p>
     <w:p>
       <w:r>
-        <w:t>Full texts were retrieved in a fixed order: arXiv HTML, then arXiv PDF (arXiv identifier from a title search, accepted at a normalised title similarity of at least 0.95 and an arXiv year no earlier than the venue year minus one; ambiguous matches excluded), then the open proceedings (CVF, PMLR). OpenReview was not scraped. Papers without a full text were counted and not imputed. From each full text an excerpt of at most 15,000 characters was built from the end of the introduction, sections whose heading concerned availability, reproducibility, ethics, data, setup, implementation, training, compute or limitations, the NeurIPS checklist items on reproducibility, and paragraphs on seeds and repeated runs, with a truncation flag per paper.</w:t>
+        <w:t>Full texts were retrieved in a fixed order: arXiv HTML, then arXiv PDF (arXiv identifier from a title search, accepted at a normalised title similarity of at least 0.95 and an arXiv year no earlier than the venue year minus one; ambiguous matches excluded), then the open proceedings (CVF, PMLR). OpenReview was not scraped. Papers without a retrievable full text remained in the study frame but were excluded from documentation coding. We reported retrieval failures by group and venue-year. From each full text an excerpt of at most 15,000 characters was built from the end of the introduction, sections whose heading concerned availability, reproducibility, ethics, data, setup, implementation, training, compute or limitations, the NeurIPS checklist items on reproducibility, and paragraphs on seeds and repeated runs, with a truncation flag per paper.</w:t>
       </w:r>
     </w:p>
     <w:p>
@@ -315,7 +315,7 @@
     </w:p>
     <w:p>
       <w:r>
-        <w:t>Coding was done by language-model subagents (claude-sonnet-5-5), 20 papers per batch, with venue, year and group hidden. Coder 1 coded all papers and coder 2 a random 25% (813 papers). The protocol set a gate of kappa 0.80 on each primary field (code, main data access, weights, variance, compute). Code (0.85), main data access (0.83) and weights (0.96) met the gate and use coder 1's codes. Variance (0.71) and compute (0.70) did not; as the protocol required, coder 2 then coded these two fields for all papers and every disagreement (1,404 items) was adjudicated by a blind adjudicator (claude-opus-5-5) who saw the two labels in random order and gave a reason.</w:t>
+        <w:t>Coding was done by language-model subagents (claude-sonnet-5-5), 20 papers per batch, with venue, year and group hidden. Coder 1 coded all papers and coder 2 a random 25% (813 papers). Agreement exceeded the prespecified kappa threshold of 0.80 for code release (0.85), main data access (0.83) and weights (0.96). We therefore used coder 1's labels for these fields. Agreement was below the threshold for variance (0.71) and compute (0.70). These fields underwent duplicate coding across the full sample, followed by blinded adjudication of all 1,404 disagreements by a language model (claude-opus-5-5) that saw the two labels in random order and gave a reason.</w:t>
       </w:r>
     </w:p>
     <w:p>
@@ -336,7 +336,7 @@
     </w:p>
     <w:p>
       <w:r>
-        <w:t xml:space="preserve">A paper was attempted if it had at least one logbook, decided if at least one of its claims was rated verified or falsified, and fully verified if some logbook verified every claim it rated. Logbooks were deduplicated, and the first author's own logbooks were excluded because the first author took part in the challenge. Of the 6,341 ICML 2026 papers, 622 candidates labelled </w:t>
+        <w:t xml:space="preserve">A paper was classified as attempted if it had at least one logbook, and as decided if at least one claim received a verified or falsified verdict. We classified it as fully verified if at least one logbook verified every claim assessed in that logbook. Logbooks were deduplicated, and the first author's own logbooks were excluded because the first author took part in the challenge. Of the 6,341 ICML 2026 papers, 622 candidates labelled </w:t>
       </w:r>
       <w:r>
         <w:rPr>
@@ -351,7 +351,7 @@
     </w:p>
     <w:p>
       <w:r>
-        <w:t>To test whether stated practices agree with what reproducers obtained (reference standard), two blind coders read the logbooks of the 222 attempted ICML 2026 papers in the frame and coded whether the authors' code was obtained and run, the main data obtained, and weights used; disagreements were adjudicated as above. A further random 300 attempted ICML 2026 papers outside the frame were added later under a prespecified extension (Note 9-17).</w:t>
+        <w:t>To assess agreement between reported practices and material use (reference standard), two blind coders read the logbooks of the 222 attempted ICML 2026 papers in the frame and coded whether the authors' code was obtained and run, the main data obtained, and weights used; disagreements were adjudicated as above. A further random 300 attempted ICML 2026 papers outside the frame were added later under a prespecified extension (Note 9-17).</w:t>
       </w:r>
     </w:p>
     <w:p>
@@ -377,12 +377,12 @@
         <w:t>unclear</w:t>
       </w:r>
       <w:r>
-        <w:t xml:space="preserve"> excluded and counted), by group and venue-year, with Wilson intervals [12]. The difference between groups was pooled over the nine venue-years as a Mantel-Haenszel risk difference [14], with a 95% interval from 2,000 paper bootstrap resamples within strata (seed 20261017; results identical under two hash seeds). Three directional hypotheses were prespecified: medical papers report open main data, release weights and report variance less often; each was to be accepted only if the pooled interval excluded zero in that direction.</w:t>
+        <w:t xml:space="preserve"> excluded and counted), by group and venue-year, with Wilson intervals [12]. The difference between groups was pooled over the nine venue-years as a Mantel-Haenszel risk difference [14], with a 95% interval from 2,000 paper bootstrap resamples within strata (seed 20261017; results identical under two hash seeds). Three directional hypotheses were prespecified: medical papers report open main data, release weights and report variance less often; each was to be supported only if the pooled interval excluded zero in that direction.</w:t>
       </w:r>
     </w:p>
     <w:p>
       <w:r>
-        <w:t xml:space="preserve">For reproduction outcomes the primary analysis compared the decided share of attempted papers by group, unadjusted and adjusted for compute tier and data scale. Post hoc analyses (Notes 9-9 to 9-15), each with its reading rule frozen before computing, examined how many teams attempted each paper, the strength of the first team (the share of its other attempted papers on which its own latest logbook was decided, the paper itself left out), within-team claim-level differences, and the cost of checking each claim. For the last, two blind coders labelled every distinct claim text of the 110 attempted medical papers and of 110 randomly drawn attempted other papers as needing inference only, retraining, large-scale runs, or analysis only; the claim texts reveal the subject, so these coders were blind to the group label but not to the domain. An adjustment was read as accounting for a gap if the adjusted estimate was less than half the unadjusted one and its interval included zero. Adversarial checks (Notes 9-12 and 9-14) stated in advance what would refute each main claim. After an internal review of this manuscript, three further post hoc analyses were frozen before their intervals were computed (Note 9-22): documentation differences among empirical papers only (papers that stated a training-set size), release fields with </w:t>
+        <w:t xml:space="preserve">For reproduction outcomes the primary analysis compared the decided share of attempted papers by group, unadjusted and adjusted for compute tier and data scale. Post hoc analyses (Notes 9-9 to 9-15) examined how many teams attempted each paper, the first team's performance on other papers, within-team claim-level differences, and the requirements of each claim. We measured first-team performance as the proportion of its other attempted papers with a decided claim in that team's latest logbook, excluding the focal paper. For claim requirements, two blind coders classified every distinct claim text of the 110 attempted medical papers and of 110 randomly drawn attempted other papers as needing inference only, retraining, large-scale runs, or analysis only; the claim texts reveal the subject, so these coders were blind to the group label but not to the domain. We prespecified a descriptive criterion for interpreting adjusted estimates: the absolute difference had to decrease by more than half, and its 95% interval had to include zero. Meeting this criterion was not interpreted as evidence of causation. Adversarial checks (Notes 9-12 and 9-14) stated in advance what would refute each main claim. After an internal review of this manuscript, three further post hoc analyses were frozen before their intervals were computed (Note 9-22): documentation differences among papers reporting a training-set size, which we used as an operational definition of empirical papers; release fields with </w:t>
       </w:r>
       <w:r>
         <w:rPr>
@@ -392,7 +392,7 @@
         <w:t>unclear</w:t>
       </w:r>
       <w:r>
-        <w:t xml:space="preserve"> counted as not released, and the mix of verdicts by group. We did not correct for multiple comparisons; the post hoc analyses are exploratory.</w:t>
+        <w:t xml:space="preserve"> treated as no reported release; and the mix of verdicts by group. We did not correct for multiple comparisons; the post hoc analyses are exploratory.</w:t>
       </w:r>
     </w:p>
     <w:p>
@@ -440,7 +440,7 @@
     </w:p>
     <w:p>
       <w:r>
-        <w:t>Figure 2 shows the flow of papers. Of the 4,340 papers in the frame, full texts were retrieved for 3,278 (1,568 medical and 1,710 other papers); 1,057 could not be matched to a full text, 4 failed to download and 1 had no usable text. Retrieval was complete or nearly complete for ICML, CVPR and ICCV, which have open proceedings, and lowest for NeurIPS 2026 (165 of 431 medical and 212 of 431 other papers) and the other venue-years that relied on arXiv alone (Table A1). It was lower for medical than for other papers (72.3% against 78.8%). Of the excerpts, 2,793 reached the 15,000-character cap.</w:t>
+        <w:t>Figure 2 shows the flow of papers. Of the 4,340 papers in the frame, full texts were retrieved for 3,278 (1,568 medical and 1,710 other papers); 1,057 could not be matched to a full text, 4 failed to download and 1 had no usable text. Retrieval was complete or nearly complete for ICML, CVPR and ICCV, which have open proceedings, and lowest for NeurIPS 2026 (165 of 431 medical and 212 of 431 other papers) and the other venue-years that relied on arXiv alone (Table A1). It was lower for medical than for other papers (72.3% against 78.8%). Of the excerpts, 2,793 reached the 15,000-character limit.</w:t>
       </w:r>
     </w:p>
     <w:p>
@@ -451,22 +451,32 @@
         <w:rPr>
           <w:rFonts w:ascii="Times New Roman" w:hAnsi="Times New Roman"/>
         </w:rPr>
-        <w:t>Documentation practices</w:t>
+        <w:t>Reported practices</w:t>
       </w:r>
     </w:p>
     <w:p>
       <w:r>
-        <w:t>Table 1 and Figure 3 give every indicator. Among papers with a known value, medical papers stated nine of the ten practices more often than other papers. They released code in 59.4% of papers with a known value against 46.2% (pooled difference +13.1 points, 95% CI +9.6 to +16.6), reported open main data in 83.7% against 67.3% (+15.0, +10.7 to +19.3), released weights in 48.6% against 19.4% (+28.6, +21.6 to +35.0) and reported variance in 66.4% against 42.1% (+24.4, +20.7 to +27.9). None of the three prespecified hypotheses was accepted: all three differences ran in the opposite direction. The exception was claims listed and each tied to a table, figure or theorem, which was rare in both groups (2.7% against 6.1%, −3.3 points, −4.7 to −1.9). Compute was rarely stated by either group (21.7% and 17.1% gave an amount), and most papers did not state their compute tier (1,349 of 1,568 medical papers).</w:t>
+        <w:t>Table 1 and Figure 3 give every indicator. Among papers with a known value for each field, medical papers more often reported code release (59.4% versus 46.2%; pooled difference +13.1 percentage points, 95% CI +9.6 to +16.6), open main data (83.7% versus 67.3%; +15.0, +10.7 to +19.3), weights release (48.6% versus 19.4%; +28.6, +21.6 to +35.0) and variance (66.4% versus 42.1%; +24.4, +20.7 to +27.9). Medical papers had higher reporting rates for nine of the ten indicators. None of the three prespecified directional hypotheses was supported. For each practice, the estimated difference favoured medical papers. The exception was claims listed and each linked to a table, figure or theorem, which was rare in both groups (2.7% versus 6.1%; −3.3, −4.7 to −1.9). Compute was rarely reported by either group (21.7% and 17.1% gave an amount), and most papers did not report their compute tier (1,349 of 1,568 medical papers).</w:t>
       </w:r>
     </w:p>
     <w:p>
       <w:r>
-        <w:t>The four main differences survived every prespecified check (Note 9-12, F1): leaving out each venue-year in turn, using coder 1's or coder 2's codes alone, restricting to papers whose excerpt was not truncated, and stratifying by venue-year and excerpt length. They held for clinical and life-science papers separately and for vision venues (CVPR, ICCV, ECCV) and learning venues (ICLR, ICML, NeurIPS) separately, except open main data at vision venues (+7.5, −1.9 to +16.9).</w:t>
+        <w:t>The four differences remained positive across the specified sensitivity analyses (Note 9-12, F1): leaving out each venue-year in turn, using coder 1's or coder 2's codes alone, restricting to papers whose excerpt was not truncated, and stratifying by venue-year and excerpt length. They also remained positive for clinical and life-science papers separately and for vision venues (CVPR, ICCV, ECCV) and learning venues (ICLR, ICML, NeurIPS) separately, except open main data at vision venues (+7.5, −1.9 to +16.9).</w:t>
       </w:r>
     </w:p>
     <w:p>
       <w:r>
-        <w:t>The comparison group contained more papers without an experiment on data: 43.7% of other papers stated no training-set size, against 28.0% of medical papers. Among the 1,129 medical and 962 other papers that stated one, the differences were smaller but all four held (Table 4): code +10.6 (+6.0 to +15.0), open main data +7.1 (+2.1 to +12.2), weights +21.7 (+12.7 to +30.7) and variance +24.7 (+20.1 to +29.3). Release fields were often not stated at all: a statement on weights could be coded for 280 of 1,568 medical papers. With unstated releases counted as none, medical papers still reported open main data more often (46.2% against 24.7%, +21.7, +18.4 to +24.7), but the weights difference fell to +3.1 points (+1.3 to +4.8), and the differences in synthetic or sample data (−0.6, −1.7 to +0.5) and outputs (−0.2, −1.2 to +0.8) disappeared.</w:t>
+        <w:t xml:space="preserve">A training-set size was not reported in 43.7% of other papers and 28.0% of medical papers. Among the 1,129 medical and 962 other papers reporting a training-set size, all four differences remained positive: code +10.6 percentage points (+6.0 to +15.0), open main data +7.1 (+2.1 to +12.2), weights +21.7 (+12.7 to +30.7) and variance +24.7 (+20.1 to +29.3) (Table 4). Release fields were often not reported at all: a statement on weights could be coded for 280 of 1,568 medical papers. In a sensitivity analysis treating </w:t>
+      </w:r>
+      <w:r>
+        <w:rPr>
+          <w:rFonts w:ascii="Courier New" w:hAnsi="Courier New"/>
+          <w:sz w:val="20"/>
+        </w:rPr>
+        <w:t>unclear</w:t>
+      </w:r>
+      <w:r>
+        <w:t xml:space="preserve"> as no reported release, medical papers still more often reported open main data (46.2% versus 24.7%; +21.7, +18.4 to +24.7). The estimated weights difference decreased to +3.1 percentage points (+1.3 to +4.8). Intervals for sample or synthetic data (−0.6, −1.7 to +0.5) and outputs (−0.2, −1.2 to +0.8) included zero.</w:t>
       </w:r>
     </w:p>
     <w:p>
@@ -482,17 +492,17 @@
     </w:p>
     <w:p>
       <w:r>
-        <w:t>Medical papers were attempted about as often as other papers (110 of 328, 33.5%, against 1,821 of 5,391, 33.8%) but by fewer teams (mean 1.5 against 3.3 teams per attempted paper). Among attempted papers, 46.4% of medical papers were decided against 65.5% of other papers, a difference of −19.1 points (95% CI −28.4 to −9.6; permutation p &lt; 0.001). The gap was larger for clinical papers (−23.6, −36.2 to −10.9) than for life-science papers (−13.4, −27.5 to +0.9), and it remained when every logbook of the team with the most medical attempts was dropped (−19.1, −29.7 to −8.7). The same direction held for full verification (−19.3, −22.1 to −15.7) and for any falsified claim (−10.8, −16.9 to −4.1). Claims of medical papers were rated verified in 21.7% against 49.7% and inconclusive in 49.2% against 24.8%; toy verdicts were about as common (25.5% against 20.9%, +4.7, −0.6 to +10.7). In the prespecified analysis on the 222 attempted frame papers, the gap was −17.0 points (−29.7 to −4.4); adjusting for stated compute tier and data scale left it at −14.7 (−28.8 to −0.5), so scale did not account for it.</w:t>
+        <w:t>Medical papers were attempted about as often as other papers (110 of 328, 33.5%, against 1,821 of 5,391, 33.8%) but by fewer teams (mean 1.5 against 3.3 teams per attempted paper). Among attempted papers, 46.4% of medical papers were decided against 65.5% of other papers, a difference of −19.1 percentage points (95% CI −28.4 to −9.6; permutation p &lt; 0.001). The estimated difference was −23.6 percentage points for clinical papers (95% CI −36.2 to −10.9) and −13.4 for life-science papers (−27.5 to +0.9), and it was −19.1 (−29.7 to −8.7) when every logbook of the team with the most medical attempts was dropped. The difference was also negative for full verification (−19.3, −22.1 to −15.7) and for any falsified claim (−10.8, −16.9 to −4.1). Claims of medical papers were rated verified in 21.7% against 49.7% and inconclusive in 49.2% against 24.8%. Toy verdicts accounted for 25.5% of medical claims and 20.9% of other claims (difference +4.7 percentage points, 95% CI −0.6 to +10.7). In the prespecified analysis on the 222 attempted frame papers, the difference was −17.0 percentage points (−29.7 to −4.4); adjustment for reported compute tier and data scale changed it to −14.7 (−28.8 to −0.5).</w:t>
       </w:r>
     </w:p>
     <w:p>
       <w:r>
-        <w:t>Table 2 and Figure 4 show the post hoc decomposition. Within the same team, claims of medical papers were decided 3.6 points less often than claims of other papers (−7.8 to +0.8), against 29.1 points less often without this adjustment, so most of the claim-level gap lies between teams rather than within them. This comparison holds the team fixed but not the claims, and its interval does not rule out a smaller difference in how the judge rated medical claims. The first team to take up a medical paper had settled 40.0% of its other attempted papers, against 60.3% for teams first on other papers (−20.3, −26.0 to −14.3). Team strength behaved as a property of the team: on 903 papers attempted by at least two teams, the stronger team decided the same paper 32.3 points more often than the weaker one (+29.9 to +34.7). Adjusting for first-team strength reduced the decided gap from −19.1 to −3.6 points (−11.9 to +5.1), which meets the reading rule. It did not account for full verification: on all attempted papers that gap was −11.7 points (−14.7 to −8.0) after the adjustment. Whether a paper listed and linked its claims did not account for the decided gap either (adjusted −15.3 points, −28.5 to −2.2; 216 frame papers); few attempted papers in either group linked each claim to a result (3 medical and 9 other papers).</w:t>
+        <w:t>Table 2 and Figure 4 show the post hoc analyses. In comparisons within the same team, the difference in the proportion of claims decided decreased from −29.1 to −3.6 percentage points (95% CI −7.8 to +0.8). The first team to take up a medical paper had a decided claim on 40.0% of its other attempted papers, against 60.3% for teams first on other papers (−20.3, −26.0 to −14.3). Among 903 papers attempted by at least two teams, the team with better performance on other papers was more likely to obtain a decided verdict on the same paper (difference +32.3 percentage points, 95% CI +29.9 to +34.7). After adjustment for the first team's performance on other papers, the difference in papers with a decided claim decreased from −19.1 to −3.6 percentage points (95% CI −11.9 to +5.1). A difference in full verification remained (−11.7, −14.7 to −8.0). Adjustment for whether a paper listed and linked its claims changed the decided difference to −15.3 percentage points (−28.5 to −2.2; 216 frame papers); few attempted papers in either group linked each claim to a result (3 medical and 9 other papers).</w:t>
       </w:r>
     </w:p>
     <w:p>
       <w:r>
-        <w:t>Claims of medical papers were also costlier to check: of 1,083 claims coded in the subsample of 220 papers, 56.7% of medical against 39.1% of other claims needed retraining or large-scale runs (+17.6, +9.7 to +25.8), and fewer could be settled by analysis alone (19.3% against 45.3%). In this subsample, the full-verification gap was −19.1 points, −13.0 (−20.7 to −5.1) after adjusting for first-team strength, and −5.6 (−11.9 to +1.4) after adjusting for both strength and claim cost.</w:t>
+        <w:t>In the 220-paper subsample, coders classified 56.7% of medical claims and 39.1% of other claims as requiring retraining or large-scale runs (difference +17.6 percentage points, 95% CI +9.7 to +25.8), and 19.3% and 45.3% as checkable by analysis alone. In this subsample, the full-verification difference was −19.1 percentage points, −13.0 (−20.7 to −5.1) after adjustment for first-team performance, and −5.6 (−11.9 to +1.4) after adjustment for both first-team performance and claim requirements.</w:t>
       </w:r>
     </w:p>
     <w:p>
@@ -503,12 +513,12 @@
         <w:rPr>
           <w:rFonts w:ascii="Times New Roman" w:hAnsi="Times New Roman"/>
         </w:rPr>
-        <w:t>Stated practices against what reproducers obtained</w:t>
+        <w:t>Reported practices against logbook evidence</w:t>
       </w:r>
     </w:p>
     <w:p>
       <w:r>
-        <w:t>On the 222 attempted frame papers, a stated code release agreed poorly with reproducers having run the authors' code (sensitivity 0.74, specificity 0.56, kappa 0.22; n = 162 with a known value on both sides), and stated open data agreed poorly with reproducers having obtained the data (kappa 0.13, n = 89). Weights agreed better (kappa 0.55, n = 43). Pooled with the 300 extension papers, the kappas were 0.28 (n = 347), 0.16 (n = 163) and 0.60 (n = 118). In NeurIPS papers, the checklist answer on open code agreed with the coded code release at kappa 0.22 (n = 152) (Table 3).</w:t>
+        <w:t>On the 222 attempted frame papers, agreement between reported code release and logbook evidence that the authors' code had been run was limited (kappa 0.22; n = 162; sensitivity 0.74, specificity 0.56). Agreement between reported open data and logbook evidence that the data were obtained was also limited (kappa 0.13, n = 89), and higher for weights (kappa 0.55, n = 43). Pooled with the 300 extension papers, the kappas were 0.28 (n = 347), 0.16 (n = 163) and 0.60 (n = 118). In the NeurIPS subset, agreement between checklist answers on code availability and the coded release statements was also limited (kappa 0.22, n = 152) (Table 3).</w:t>
       </w:r>
     </w:p>
     <w:p>
@@ -535,7 +545,12 @@
     </w:p>
     <w:p>
       <w:r>
-        <w:t>Across nine venue-years of six top ML venues, medical papers stated code, open data and variance more often than other papers did, also among empirical papers only. This contradicts the assumption we set out to test. Weights and other releases were stated too rarely to compare. Yet in the one venue where outcomes could be observed, medical papers were settled less often by agentic reproducers, and their undecided claims were mostly inconclusive rather than checked at reduced scale. Within teams, medical and other claims were decided about equally often, which places most of the gap between teams rather than in the judge's ratings, although a small judge effect cannot be excluded. Medical papers were taken up by fewer teams, and first by teams that settled fewer papers of any kind; this accounted for the gap in being decided at all. The gap in full verification also needed the higher cost of checking medical claims to be accounted for, in a subsample of 220 papers.</w:t>
+        <w:t>Medical papers more often reported code release, open main data and variance than other papers at the same venues. These differences remained among papers reporting a training-set size. Statements about weights and other releases were often missing, and their estimated differences were sensitive to how missing values were handled.</w:t>
+      </w:r>
+    </w:p>
+    <w:p>
+      <w:r>
+        <w:t>In the ICML 2026 challenge, medical papers were attempted by fewer teams and less often received a verified or falsified verdict on at least one claim. Adjustment for the first team's performance on other papers reduced this difference from −19.1 to −3.6 percentage points. A difference in full verification remained. In the 220-paper subsample, this difference was further reduced after adjustment for the coded computational requirements of claims. These exploratory results identify factors associated with reproduction outcomes; they do not establish why the outcomes differed.</w:t>
       </w:r>
     </w:p>
     <w:p>
@@ -551,7 +566,7 @@
     </w:p>
     <w:p>
       <w:r>
-        <w:t>An earlier survey found weaker sharing in ML for health than in other ML areas [2], and audits of medical imaging found low rates of shared and working code in radiology journals [3] and at a medical imaging conference [4]. Our frame differs: it covers only papers accepted at general ML venues, several of which have introduced code policies and checklists [6], and it compares medical papers with other papers at the same venues and in the same years. Within this setting the medical papers documented more. Earlier audits measured documentation alone [5], or tested whether shared code ran [3, 4]; here documentation could be compared with what independent reproducers obtained, and a stated code link agreed with a reproducer actually running the authors' code at a kappa of only 0.22. PaperBench evaluated agents on a fixed set of 20 ICML 2024 Spotlight and Oral papers [8]; in an open challenge, by contrast, participants choose what to attempt, and the challenge data show that the domain of a paper changes who attempts it and what is asked.</w:t>
+        <w:t>An earlier survey found weaker sharing in ML for health than in other ML areas [2], and audits of medical imaging found low rates of shared and working code in radiology journals [3] and at a medical imaging conference [4]. Our frame differs: it covers only papers accepted at general ML venues, several of which have introduced code policies and checklists [6], and it compares medical papers with other papers at the same venues and in the same years. In our sample, medical papers more often reported code release, open main data and variance. Earlier audits assessed reporting [5] or tested whether shared code ran [3, 4]; here reported practices could be compared with logbook evidence from independent reproduction attempts, and agreement for code was limited (kappa 0.22). PaperBench evaluated agents on a fixed set of 20 ICML 2024 Spotlight and Oral papers [8]; in an open challenge, by contrast, participants choose what to attempt. In this challenge, paper domain was associated with the performance of the teams attempting a paper and with the requirements of its claims.</w:t>
       </w:r>
     </w:p>
     <w:p>
@@ -567,7 +582,7 @@
     </w:p>
     <w:p>
       <w:r>
-        <w:t>A verified rate reported without the teams behind it would mislead readers about medical papers, whose documentation is not the weak point. Reporting guidelines for ML-based science [15], for clinical prediction models that use ML [16] and for deep learning in medical imaging [17] concern what authors state; at these venues medical papers already state more than others, and whether a crowd settles them depends on more than what is stated. The recommendations below follow from the measurements in this study; none of them was tested as an intervention.</w:t>
+        <w:t>An unadjusted verification rate combines paper characteristics with differences in who attempts the papers and how the attempts are conducted. It should therefore be interpreted alongside team participation, performance on other papers and claim requirements. Reporting guidelines for ML-based science [15], for clinical prediction models that use ML [16] and for deep learning in medical imaging [17] concern what authors report. We propose the following reporting changes based on the gaps identified in this study. We did not test whether these changes improve reproduction outcomes.</w:t>
       </w:r>
     </w:p>
     <w:p>
@@ -591,7 +606,7 @@
         <w:pStyle w:val="ListBullet"/>
       </w:pPr>
       <w:r>
-        <w:t>State each main claim explicitly and tie it to the table, figure or theorem that supports it. Only 2.7% of medical and 6.1% of other papers did so, and the challenge organisers had to extract claims from abstracts instead [9].</w:t>
+        <w:t>List the main claims and link each to its supporting table, figure or theorem. This mapping was present in 2.7% of medical papers and 6.1% of other papers.</w:t>
       </w:r>
     </w:p>
     <w:p>
@@ -599,7 +614,7 @@
         <w:pStyle w:val="ListBullet"/>
       </w:pPr>
       <w:r>
-        <w:t>State the access route of the main dataset in the paper (open, credentialed, on request or private), not only its name. Access could not be coded from the text for 702 of 1,568 medical papers.</w:t>
+        <w:t>Specify how the main data can be accessed: openly, with credentials, on request or privately. Access could not be coded from the text for 702 of 1,568 medical papers.</w:t>
       </w:r>
     </w:p>
     <w:p>
@@ -607,7 +622,7 @@
         <w:pStyle w:val="ListBullet"/>
       </w:pPr>
       <w:r>
-        <w:t>State releases explicitly, including what is not released (weights, outputs, sample or synthetic data). Weights were unstated in 1,288 of 1,568 medical papers.</w:t>
+        <w:t>State whether weights, outputs and sample or synthetic data are released, including when they are not. Weights were not reported in 1,288 of 1,568 medical papers.</w:t>
       </w:r>
     </w:p>
     <w:p>
@@ -615,7 +630,7 @@
         <w:pStyle w:val="ListBullet"/>
       </w:pPr>
       <w:r>
-        <w:t>State the compute a claim needs (hardware and time). The compute tier was unstated in 1,349 of 1,568 medical papers, and medical claims more often needed retraining or large-scale runs.</w:t>
+        <w:t>Report the hardware and runtime required to check each main claim. The compute tier was not reported in 1,349 of 1,568 medical papers.</w:t>
       </w:r>
     </w:p>
     <w:p>
@@ -628,7 +643,7 @@
         <w:pStyle w:val="ListBullet"/>
       </w:pPr>
       <w:r>
-        <w:t>Extract each claim together with the result it refers to (table, figure or theorem), so that a verdict is attached to a specific result rather than to a sentence of the abstract.</w:t>
+        <w:t>Link each extracted claim to the specific result being checked, including its table, figure or theorem. The challenge used claims extracted from abstracts [9].</w:t>
       </w:r>
     </w:p>
     <w:p>
@@ -636,7 +651,7 @@
         <w:pStyle w:val="ListBullet"/>
       </w:pPr>
       <w:r>
-        <w:t>Record in each logbook, per claim, whether the authors' code was run, the main data obtained and the weights used. These facts had to be reconstructed from free text for the reference standard here, and they differed from what papers state.</w:t>
+        <w:t>Record in each logbook, per claim, whether the authors' code was run, the main data obtained and the weights used.</w:t>
       </w:r>
     </w:p>
     <w:p>
@@ -644,7 +659,7 @@
         <w:pStyle w:val="ListBullet"/>
       </w:pPr>
       <w:r>
-        <w:t>Record what each check needed (inference only, retraining, large-scale runs) and the compute it used, and give a reason with every inconclusive verdict, since most undecided medical claims were inconclusive rather than toy.</w:t>
+        <w:t>For each claim, record the type of check: inference, retraining, large-scale runs or analysis only. Report the compute used and give a reason for an inconclusive verdict.</w:t>
       </w:r>
     </w:p>
     <w:p>
@@ -652,7 +667,7 @@
         <w:pStyle w:val="ListBullet"/>
       </w:pPr>
       <w:r>
-        <w:t>Report per paper the number of teams that attempted it and their track record on other papers, and report domain comparisons adjusted for both, because the first team's strength alone accounted for the gap in being decided.</w:t>
+        <w:t>Report the number of teams attempting each paper and their performance on other papers. Present unadjusted domain comparisons alongside analyses accounting for these factors.</w:t>
       </w:r>
     </w:p>
     <w:p>
@@ -665,7 +680,7 @@
         <w:pStyle w:val="ListBullet"/>
       </w:pPr>
       <w:r>
-        <w:t>Ask authors to map each listed contribution to its supporting result in the reproducibility checklist, and to state data access and releases in fixed categories, because checklist answers agreed only moderately with the text (code: kappa 0.22).</w:t>
+        <w:t>Use explicit categories for data access and material release, and ask authors to link each main claim to its supporting result. In the NeurIPS subset, agreement between checklist answers on code availability and the coded release statements was limited (kappa 0.22).</w:t>
       </w:r>
     </w:p>
     <w:p>
@@ -681,7 +696,7 @@
     </w:p>
     <w:p>
       <w:r>
-        <w:t xml:space="preserve">The frame is a census of medical papers at nine venue-years with a matched comparison group, the protocol and coding rules were fixed before data collection, every coding decision is public, and the main documentation differences survived prespecified attempts to refute them. The study has several limitations. All coders, adjudicators and the challenge judge are language models; agreement between coders was high, but they may share systematic errors, and verdicts on the same claim from different logbooks agreed poorly in the challenge as a whole [13]. The comparison group contains more papers without experiments, which explains part of the documentation differences, although all four main differences held among empirical papers. Full texts were missing for a quarter of the frame, mostly at NeurIPS 2026 and ICLR, where we relied on arXiv; retrieval was lower for medical papers, and papers posted on arXiv may document more than papers that are not. Many excerpts were truncated, so release fields are often </w:t>
+        <w:t xml:space="preserve">The frame included all papers identified as clinical or life science by the screening procedure, together with a random comparison sample allocated across the same venue-years. The protocol and coding rules were fixed before sample selection, every coding decision is public, and the main reporting differences remained positive across the specified sensitivity analyses. The study has several limitations. All coders, adjudicators and the challenge judge are language models; agreement between coders was high, but they may share systematic errors, and verdicts on the same claim from different logbooks agreed poorly in the challenge as a whole [13]. More comparison papers lacked a reported training-set size. Restricting the analysis to papers reporting one reduced the differences for code, open data and weights, while all four estimated differences remained positive. Full texts were missing for a quarter of the frame, mostly at NeurIPS 2026 and ICLR, where we relied on arXiv; retrieval was lower for medical papers, and papers posted on arXiv may report more than papers that are not. Many excerpts reached the character limit, which may have omitted relevant release statements. Release fields were often coded as </w:t>
       </w:r>
       <w:r>
         <w:rPr>
@@ -691,17 +706,7 @@
         <w:t>unclear</w:t>
       </w:r>
       <w:r>
-        <w:t xml:space="preserve">, and with </w:t>
-      </w:r>
-      <w:r>
-        <w:rPr>
-          <w:rFonts w:ascii="Courier New" w:hAnsi="Courier New"/>
-          <w:sz w:val="20"/>
-        </w:rPr>
-        <w:t>unclear</w:t>
-      </w:r>
-      <w:r>
-        <w:t xml:space="preserve"> counted as none most release differences shrink or disappear. Coded practices are what authors state, not working artifacts. We did not characterise how teams reproduced papers: the agents, the degree of human steering and the compute they used vary across logbooks [9] and were not coded, so first-team strength may partly stand for the method a team used. The reproduction outcomes come from one venue, one challenge and one judge model, and the challenge's participants chose what to attempt. Protocol 9 was designed after the results of earlier protocols on the same challenge were known, including the higher rate of code links in medical papers. The explanations of the outcome gap are post hoc, rest on a chain of analyses without correction for multiple comparisons, and use different samples for team strength (all attempted papers) and claim cost (220 papers); they should be read as exploratory. The analyses are observational.</w:t>
+        <w:t>, and several estimated differences decreased when these values were treated as no reported release. Coded practices are what authors report, not working artifacts. Performance on other papers may reflect the agents, human input, compute and paper selection of a team. We did not measure these components separately. The reproduction outcomes come from one venue, one challenge and one judge model, and the challenge's participants chose what to attempt. Protocol 9 was developed after the results of earlier protocols on the same challenge were known, including the higher rate of code links in medical papers. Analyses of team performance and claim requirements were post hoc and were not adjusted for multiple comparisons. They used different samples: all attempted papers for team performance and a 220-paper subsample for claim requirements. The adjusted estimates are exploratory and do not establish causal explanations.</w:t>
       </w:r>
     </w:p>
     <w:p>
@@ -717,7 +722,7 @@
     </w:p>
     <w:p>
       <w:r>
-        <w:t>Medical papers at top ML venues are not less documented than other papers, yet agentic crowd reproduction settles them less often. More documentation alone is unlikely to close that gap. Explicit claims tied to specific results would make medical papers easier to check, and reports of crowd reproduction need to show who attempted each paper before its verdict can be compared across fields.</w:t>
+        <w:t>Medical papers more often reported several reproducibility practices than other papers at the same ML venues. In the ICML 2026 challenge, they less often received a verified or falsified verdict on at least one claim. Exploratory analyses associated these outcomes with team performance and, in a subsample, the computational requirements of claims. Reporting practices and reproduction outcomes should therefore be assessed separately. Authors should link their main claims to specific results, and reproduction reports should document team participation, material use and the resources required for each check.</w:t>
       </w:r>
     </w:p>
     <w:p>
@@ -739,7 +744,7 @@
         <w:t>Data availability.</w:t>
       </w:r>
       <w:r>
-        <w:t xml:space="preserve"> The paper-level table (4,340 papers with identifiers, titles, group, full-text status and all codes), the claim codes, the frozen protocol and all aggregate results are available at https://github.com/kondratevakate/life-science-at-ml-venues [DOI to be added on release] (code MIT licence; data and text CC BY 4.0). Abstracts and full texts were retrieved from public conference websites, arXiv and open proceedings and are not redistributed for copyright reasons; the repository contains the retrieval scripts and SHA-256 manifests of the retrieved files. Challenge verdicts come from the public snapshot of the ICML 2026 agent reproduction challenge retrieved on 17 October 2026. No patient data were used.</w:t>
+        <w:t xml:space="preserve"> The repository contains the paper-level table for all 4,340 papers, claim codes, frozen protocol, analysis code and aggregate results: https://github.com/kondratevakate/life-science-at-ml-venues [DOI to be added on release]. The paper-level table includes identifiers, titles, group labels, full-text retrieval status and coded fields. Code is released under the MIT licence; data and text are released under CC BY 4.0. Abstracts and full texts were retrieved from public conference websites, arXiv and open proceedings and are not redistributed for copyright reasons; the repository contains the retrieval scripts and SHA-256 manifests of the retrieved files. Challenge verdicts come from the public snapshot of the ICML 2026 agent reproduction challenge retrieved on 17 October 2026. No patient data were used.</w:t>
       </w:r>
     </w:p>
     <w:p>
@@ -815,7 +820,7 @@
         <w:t>Use of AI tools.</w:t>
       </w:r>
       <w:r>
-        <w:t xml:space="preserve"> Paper labels, full-text codes, reference-standard codes, claim codes and adjudications were produced by language-model subagents (claude-sonnet-5-5 and claude-opus-5-5) under the frozen protocol and prompts, which are public in the repository. Analysis code and drafts of this manuscript were written with the assistance of Claude (Anthropic). The authors checked every number against the result files and take responsibility for the content.</w:t>
+        <w:t xml:space="preserve"> Language models produced domain labels, documentation codes, logbook codes and claim classifications. We used claude-sonnet-5-5 for coding and claude-opus-5-5 for adjudication under the published protocol and prompts. Claude also assisted with analysis code and manuscript drafts. The authors checked every number against the result files and take responsibility for the content.</w:t>
       </w:r>
     </w:p>
     <w:p>
@@ -927,7 +932,7 @@
     </w:p>
     <w:p>
       <w:r>
-        <w:t>The study followed a written protocol (Protocol 9) frozen in a public git repository before the paper frame was drawn, before any full text was retrieved and before any coding (commit 839281e in kondratevakate/icml-2026-repro, 19 October 2026, five minutes before the first full text was retrieved). The protocol builds on three earlier protocols in the same repository (Protocols 6 to 8, on the same challenge) and was designed after their results were known. Every later decision is recorded as a dated note in the protocol (Notes 9-1 to 9-22), written before the analysis it governs was computed; analyses beyond those in the protocol are reported as post hoc and exploratory. The study was not registered in a review register. We report it following the PRISMA 2020 statement [10] where its items apply to a meta-research study of published papers; the completed checklist is Supplementary File S2. The protocol, all notes and their commit history are in Supplementary File S1 and the repository. Table A1 gives the papers in the frame and with a coded full text per venue-year.</w:t>
+        <w:t>Protocol 9 was frozen on 19 October 2026, before sample selection, full-text retrieval and coding (commit 839281e in kondratevakate/icml-2026-repro). It was developed after the results of Protocols 6 to 8 on the same challenge were known. Subsequent decisions were recorded in dated protocol notes (Notes 9-1 to 9-22) before the corresponding analyses were run. Analyses added after the original protocol are labelled post hoc and exploratory. The study was not registered in a review register. We report it following the PRISMA 2020 statement [10] where its items apply to a meta-research study of published papers; the completed checklist is Supplementary File S2. The protocol, all notes and their commit history are in Supplementary File S1 and the repository. Table A1 gives the papers in the frame and with a coded full text per venue-year.</w:t>
       </w:r>
     </w:p>
     <w:p>
@@ -935,7 +940,7 @@
         <w:rPr>
           <w:b/>
         </w:rPr>
-        <w:t>Table A1. Full texts were nearly complete where open proceedings exist and missing most often at NeurIPS 2026. Papers in the frame and with a coded full text, by group and venue-year.</w:t>
+        <w:t>Table A1. Papers in the frame and with a coded full text, by group and venue-year. Retrieval was nearly complete where open proceedings exist and lowest at NeurIPS 2026.</w:t>
       </w:r>
     </w:p>
     <w:tbl>
@@ -1586,7 +1591,7 @@
         <w:rPr>
           <w:b/>
         </w:rPr>
-        <w:t>Table 1. Medical papers state most reproducibility practices more often than other papers; only linking claims to results is rarer. Practices stated in the full text, medical versus other papers, nine venue-years. Shares among papers with a known value; pooled difference is the Mantel-Haenszel risk difference over venue-years with a 95% paper bootstrap interval.</w:t>
+        <w:t>Table 1. Reported reproducibility practices, medical versus other papers, nine venue-years. Medical papers had higher reporting rates for nine of ten indicators. Shares among papers with a known value; pooled difference is the Mantel-Haenszel risk difference over venue-years with a 95% paper bootstrap interval.</w:t>
       </w:r>
     </w:p>
     <w:tbl>
@@ -2626,7 +2631,7 @@
         <w:rPr>
           <w:b/>
         </w:rPr>
-        <w:t>Table 2. The gap in being decided disappears after adjusting for the strength of the first team; the gap in full verification needs claim cost as well. Reproduction outcomes of attempted ICML 2026 papers, medical minus other, unadjusted and adjusted (post hoc analyses, Notes 9-9 to 9-15).</w:t>
+        <w:t>Table 2. Unadjusted and adjusted differences in reproduction outcomes of attempted ICML 2026 papers, medical minus other (post hoc analyses, Notes 9-9 to 9-15). Rows marked subsample use the 220 papers with coded claim requirements.</w:t>
       </w:r>
     </w:p>
     <w:tbl>
@@ -2846,7 +2851,7 @@
               <w:rPr>
                 <w:sz w:val="18"/>
               </w:rPr>
-              <w:t>Decided, adjusted for first-team strength</w:t>
+              <w:t>Decided, adjusted for first-team performance</w:t>
             </w:r>
           </w:p>
         </w:tc>
@@ -2922,7 +2927,7 @@
               <w:rPr>
                 <w:sz w:val="18"/>
               </w:rPr>
-              <w:t>Fully verified, all attempted papers, adjusted for first-team strength</w:t>
+              <w:t>Fully verified, all attempted papers, adjusted for first-team performance</w:t>
             </w:r>
           </w:p>
         </w:tc>
@@ -2998,7 +3003,7 @@
               <w:rPr>
                 <w:sz w:val="18"/>
               </w:rPr>
-              <w:t>Fully verified, subsample, adjusted for first-team strength</w:t>
+              <w:t>Fully verified, subsample, adjusted for first-team performance</w:t>
             </w:r>
           </w:p>
         </w:tc>
@@ -3036,7 +3041,7 @@
               <w:rPr>
                 <w:sz w:val="18"/>
               </w:rPr>
-              <w:t>Fully verified, subsample, adjusted for strength and claim cost</w:t>
+              <w:t>Fully verified, subsample, adjusted for first-team performance and claim requirements</w:t>
             </w:r>
           </w:p>
         </w:tc>
@@ -3142,7 +3147,7 @@
         <w:rPr>
           <w:b/>
         </w:rPr>
-        <w:t>Table 3. What papers state agrees poorly with what reproducers obtained, except for weights. Agreement on the 222 attempted ICML 2026 frame papers; the last column pools them with the 300-paper extension sample.</w:t>
+        <w:t>Table 3. Agreement between reported practices and logbook evidence of material use, 222 attempted ICML 2026 frame papers; the last column pools them with the 300-paper extension sample. Agreement was limited for code and data and higher for weights.</w:t>
       </w:r>
     </w:p>
     <w:tbl>
@@ -3716,7 +3721,7 @@
         <w:rPr>
           <w:b/>
         </w:rPr>
-        <w:t>Table 4. The documentation differences hold among empirical papers; with unstated releases counted as none, only the open-data difference stays large. Medical minus other, Mantel-Haenszel over venue-years, points with 95% CI (post hoc, Note 9-22).</w:t>
+        <w:t>Table 4. Sensitivity analyses of reported practices, medical minus other, Mantel-Haenszel over venue-years, percentage points with 95% CI (post hoc, Note 9-22): main analysis, papers reporting a training-set size, and all coded papers with unclear treated as no reported release.</w:t>
       </w:r>
     </w:p>
     <w:tbl>
@@ -3785,7 +3790,7 @@
                 <w:b/>
                 <w:sz w:val="18"/>
               </w:rPr>
-              <w:t>Empirical papers only: known value</w:t>
+              <w:t>Papers reporting a training-set size</w:t>
             </w:r>
           </w:p>
         </w:tc>
@@ -3804,7 +3809,7 @@
                 <w:b/>
                 <w:sz w:val="18"/>
               </w:rPr>
-              <w:t>All coded papers, unclear counted as none</w:t>
+              <w:t>All coded papers, unclear as no reported release</w:t>
             </w:r>
           </w:p>
         </w:tc>
@@ -4250,14 +4255,14 @@
         <w:t>Figure 1.</w:t>
       </w:r>
       <w:r>
-        <w:t xml:space="preserve"> Medical papers state more but are settled less often, and the gap follows who takes them up. (a) Among papers that stated each practice, medical papers (orange) released code, reported open main data and reported variance more often than other papers (blue); both groups rarely tied their claims to a specific result. (b) In the ICML 2026 challenge, attempted medical papers were decided less often, with fewer claims verified and more rated inconclusive. (c) The decided gap disappears within the same team and after adjusting for the strength of the first team to take a paper up; the full-verification gap needs claim cost as well. Filled circles: interval excludes zero; open circles: interval includes zero. (d) What a paper states agrees poorly with what reproducers obtained; the dashed line marks kappa 0.40.</w:t>
+        <w:t xml:space="preserve"> Reported reproducibility practices and reproduction outcomes in medical and other papers. (a) Among papers with a known value, medical papers (orange) more often reported code release, open main data and variance than other papers (blue); both groups rarely linked their claims to a specific result. (b) In the ICML 2026 challenge, attempted medical papers less often had a decided claim, with fewer claims verified and more rated inconclusive. (c) Within-team comparisons and adjustment for first-team performance reduced the estimated difference in decided outcomes. In the 220-paper subsample, additional adjustment for claim requirements further reduced the full-verification difference. Filled circles: interval excludes zero; open circles: interval includes zero. (d) Agreement between reported practices and logbook evidence of material use; the dashed line marks kappa 0.40.</w:t>
       </w:r>
     </w:p>
     <w:p>
       <w:r>
         <w:drawing>
           <wp:inline xmlns:a="http://schemas.openxmlformats.org/drawingml/2006/main" xmlns:pic="http://schemas.openxmlformats.org/drawingml/2006/picture">
-            <wp:extent cx="5760000" cy="4561374"/>
+            <wp:extent cx="5760000" cy="4263325"/>
             <wp:docPr id="1" name="Picture 1"/>
             <wp:cNvGraphicFramePr>
               <a:graphicFrameLocks noChangeAspect="1"/>
@@ -4278,7 +4283,7 @@
                   <pic:spPr>
                     <a:xfrm>
                       <a:off x="0" y="0"/>
-                      <a:ext cx="5760000" cy="4561374"/>
+                      <a:ext cx="5760000" cy="4263325"/>
                     </a:xfrm>
                     <a:prstGeom prst="rect"/>
                   </pic:spPr>
@@ -4297,7 +4302,7 @@
         <w:t>Figure 2.</w:t>
       </w:r>
       <w:r>
-        <w:t xml:space="preserve"> Most of the frame was coded, but a quarter had no retrievable full text, more often for medical papers. Flow of papers through the study; counts per venue-year are in Table A1.</w:t>
+        <w:t xml:space="preserve"> Study selection and full-text retrieval. Full texts were retrieved for 3,278 of 4,340 papers. Retrieval was lower for medical papers than for other papers (72.3% versus 78.8%).</w:t>
       </w:r>
     </w:p>
     <w:p>
@@ -4344,7 +4349,7 @@
         <w:t>Figure 3.</w:t>
       </w:r>
       <w:r>
-        <w:t xml:space="preserve"> Medical papers state nine of ten practices more often than other papers; only linking claims to results is rarer. Mantel-Haenszel risk difference, medical minus other, over nine venue-years with 95% bootstrap intervals, among papers with a known value. Filled circles: interval excludes zero.</w:t>
+        <w:t xml:space="preserve"> Differences in reported practices among papers with a known value for each indicator. Medical papers had higher reporting rates for nine of ten indicators and a lower rate of explicit links between claims and supporting results. Mantel-Haenszel risk difference, medical minus other, over nine venue-years with 95% bootstrap intervals. Filled circles: interval excludes zero.</w:t>
       </w:r>
     </w:p>
     <w:p>
@@ -4391,14 +4396,14 @@
         <w:t>Figure 4.</w:t>
       </w:r>
       <w:r>
-        <w:t xml:space="preserve"> The gap in being decided disappears once team strength or team is accounted for; the gap in full verification also needs claim cost. Attempted ICML 2026 papers, medical minus other, with 95% bootstrap intervals. (a) Paper level: decided and fully verified, unadjusted and adjusted. (b) Claim level: share of claims decided, unadjusted and within team. Filled circles: interval excludes zero.</w:t>
+        <w:t xml:space="preserve"> Unadjusted and adjusted differences in reproduction outcomes between medical and other papers. Estimates are shown at paper level for decided and fully verified outcomes, and at claim level before and after comparisons within teams. Estimates use all attempted ICML 2026 papers (or their clinical or life-science subset, where labelled), except the last paper-level row, which uses the 220-paper subsample with coded claim requirements. Filled circles: interval excludes zero.</w:t>
       </w:r>
     </w:p>
     <w:p>
       <w:r>
         <w:drawing>
           <wp:inline xmlns:a="http://schemas.openxmlformats.org/drawingml/2006/main" xmlns:pic="http://schemas.openxmlformats.org/drawingml/2006/picture">
-            <wp:extent cx="5760000" cy="4540937"/>
+            <wp:extent cx="5760000" cy="4058413"/>
             <wp:docPr id="4" name="Picture 4"/>
             <wp:cNvGraphicFramePr>
               <a:graphicFrameLocks noChangeAspect="1"/>
@@ -4419,7 +4424,7 @@
                   <pic:spPr>
                     <a:xfrm>
                       <a:off x="0" y="0"/>
-                      <a:ext cx="5760000" cy="4540937"/>
+                      <a:ext cx="5760000" cy="4058413"/>
                     </a:xfrm>
                     <a:prstGeom prst="rect"/>
                   </pic:spPr>

</xml_diff>

<commit_message>
Cut the abstract to the main findings (461 to 336 words)
Keeps the editorial wording; the within-team estimate, the first-team adjustment details and the subsample numbers
stay in Results. The abstract number check now follows the new wording.

Co-Authored-By: Claude Opus 5.5 <noreply@anthropic.com>
</commit_message>
<xml_diff>
--- a/manuscript/out/manuscript.docx
+++ b/manuscript/out/manuscript.docx
@@ -143,7 +143,7 @@
         <w:t>Methods.</w:t>
       </w:r>
       <w:r>
-        <w:t xml:space="preserve"> We identified 2,170 clinical or life-science papers across nine venue-years at CVPR, ICCV, ECCV, ICLR, ICML and NeurIPS in 2025 and 2026, and randomly sampled 2,170 other papers. We refer to the clinical and life-science groups together as medical papers. Agreement between the domain coders was high (Cohen's kappa 0.96). One language-model coder assessed excerpts from all 3,278 retrieved full texts. A second coder independently assessed a random 25%; fields below the agreement threshold underwent duplicate coding across the full sample. Differences were pooled across venue-years with Mantel-Haenszel risk differences and paper bootstrap intervals, under a protocol frozen before sample selection. Reproduction outcomes came from the public verdicts of the ICML 2026 agent reproduction challenge.</w:t>
+        <w:t xml:space="preserve"> We identified 2,170 clinical or life-science papers (together, medical papers) across nine venue-years of CVPR, ICCV, ECCV, ICLR, ICML and NeurIPS (2025 to 2026) and randomly sampled 2,170 other papers. Under a protocol frozen before sample selection, language-model coders assessed excerpts from the 3,278 retrieved full texts for twelve reported practices, with duplicate coding of a random 25% and of all fields below the agreement threshold. Differences were pooled across venue-years as Mantel-Haenszel risk differences with bootstrap intervals. Reproduction outcomes came from the public verdicts of the ICML 2026 agent reproduction challenge.</w:t>
       </w:r>
     </w:p>
     <w:p>
@@ -154,7 +154,7 @@
         <w:t>Results.</w:t>
       </w:r>
       <w:r>
-        <w:t xml:space="preserve"> Among papers with a known code-release status, 59% of medical papers reported releasing code, compared with 46% of other papers (pooled difference +13 percentage points, 95% CI +10 to +17). Medical papers also more often reported variance (66% versus 42%; +24, +21 to +28) and open main data (+15, +11 to +19). Few papers in either group linked their main claims to a specific table, figure or theorem (2.7% versus 6.1%). In the challenge, attempted medical papers less often received a verified or falsified verdict on at least one claim than 1,821 other attempted papers (−19 percentage points, 95% CI −28 to −10), and more of their claims were rated inconclusive (49% versus 25%). In comparisons within the same team, the estimated difference in the proportion of claims decided was −3.6 percentage points (95% CI −7.8 to +0.8). After adjustment for the first team's performance on other papers, the difference in papers with a decided claim decreased from −19.1 to −3.6 percentage points (95% CI −11.9 to +5.1). A difference in full verification remained (−11.7, −14.7 to −8.0). In the 220-paper subsample, coders classified medical claims as requiring retraining or large-scale runs more often than other claims (57% versus 39%); adjustment for both first-team performance and claim requirements reduced the full-verification difference to −6 percentage points (95% CI −12 to +1). Reported practices showed limited agreement with logbook evidence of material use (code: kappa 0.22).</w:t>
+        <w:t xml:space="preserve"> Among papers with a known value, 59% of medical papers reported releasing code, compared with 46% of other papers (pooled difference +13 percentage points, 95% CI +10 to +17); medical papers also more often reported variance (+24, +21 to +28) and open main data (+15, +11 to +19). Few papers in either group linked their main claims to a specific result (2.7% versus 6.1%). In the challenge, attempted medical papers less often received a verified or falsified verdict on at least one claim (−19 percentage points, 95% CI −28 to −10), and more of their claims were rated inconclusive (49% versus 25%). In exploratory analyses, adjustment for the first team's performance on other papers reduced this difference to −3.6 percentage points (−11.9 to +5.1); a difference in full verification remained and was further reduced after adjustment for coded claim requirements in a 220-paper subsample. Reported practices showed limited agreement with logbook evidence of material use (code: kappa 0.22).</w:t>
       </w:r>
     </w:p>
     <w:p>
@@ -165,7 +165,7 @@
         <w:t>Conclusions.</w:t>
       </w:r>
       <w:r>
-        <w:t xml:space="preserve"> Medical papers reported several reproducibility practices more often than other papers at the same venues. In the ICML 2026 challenge, they less often received a verified or falsified verdict on at least one claim. Exploratory adjustments reduced this difference after accounting for first-team performance; the remaining difference in full verification was further reduced after accounting for claim requirements in a subsample. Authors should link their main claims to the results that support them.</w:t>
+        <w:t xml:space="preserve"> Medical papers reported several reproducibility practices more often than other papers at the same venues but less often received a decided verdict in the ICML 2026 challenge. Reporting and reproduction outcomes should be assessed separately, and authors should link their main claims to the results that support them.</w:t>
       </w:r>
     </w:p>
     <w:p>

</xml_diff>